<commit_message>
Update Gas Cylinder Report
</commit_message>
<xml_diff>
--- a/Gas_Cylinder_Monitoring_Report.docx
+++ b/Gas_Cylinder_Monitoring_Report.docx
@@ -773,7 +773,21 @@
           <w:sz w:val="28"/>
           <w:szCs w:val="28"/>
         </w:rPr>
-        <w:t xml:space="preserve"> (D/ADC/25/0044)</w:t>
+        <w:t xml:space="preserve"> (D/ADC/2</w:t>
+      </w:r>
+      <w:r>
+        <w:rPr>
+          <w:sz w:val="28"/>
+          <w:szCs w:val="28"/>
+        </w:rPr>
+        <w:t>6</w:t>
+      </w:r>
+      <w:r>
+        <w:rPr>
+          <w:sz w:val="28"/>
+          <w:szCs w:val="28"/>
+        </w:rPr>
+        <w:t>/0044)</w:t>
       </w:r>
     </w:p>
     <w:p>
@@ -869,6 +883,7 @@
           <w:ilvl w:val="0"/>
           <w:numId w:val="3"/>
         </w:numPr>
+        <w:spacing w:line="360" w:lineRule="auto"/>
         <w:jc w:val="both"/>
         <w:rPr>
           <w:b w:val="0"/>
@@ -896,6 +911,7 @@
           <w:ilvl w:val="0"/>
           <w:numId w:val="3"/>
         </w:numPr>
+        <w:spacing w:line="360" w:lineRule="auto"/>
         <w:jc w:val="both"/>
         <w:rPr>
           <w:b w:val="0"/>
@@ -923,6 +939,7 @@
           <w:ilvl w:val="0"/>
           <w:numId w:val="3"/>
         </w:numPr>
+        <w:spacing w:line="360" w:lineRule="auto"/>
         <w:jc w:val="both"/>
         <w:rPr>
           <w:b w:val="0"/>
@@ -950,6 +967,7 @@
           <w:ilvl w:val="0"/>
           <w:numId w:val="3"/>
         </w:numPr>
+        <w:spacing w:line="360" w:lineRule="auto"/>
         <w:jc w:val="both"/>
         <w:rPr>
           <w:b w:val="0"/>
@@ -977,6 +995,7 @@
           <w:ilvl w:val="0"/>
           <w:numId w:val="3"/>
         </w:numPr>
+        <w:spacing w:line="360" w:lineRule="auto"/>
         <w:jc w:val="both"/>
         <w:rPr>
           <w:b w:val="0"/>
@@ -994,7 +1013,17 @@
           <w:sz w:val="24"/>
           <w:szCs w:val="24"/>
         </w:rPr>
-        <w:t>Enable threshold-based leak detection with real-time alerts, independent of the forecasting models.</w:t>
+        <w:t>Use a machine-learning model to predict time until depletion and compare the accuracy of this model with the statistical estimates. Set up a system of leakage detection that would send the alarm in real time without using any predictive models</w:t>
+      </w:r>
+      <w:r>
+        <w:rPr>
+          <w:b w:val="0"/>
+          <w:bCs w:val="0"/>
+          <w:color w:val="auto"/>
+          <w:sz w:val="24"/>
+          <w:szCs w:val="24"/>
+        </w:rPr>
+        <w:t>.</w:t>
       </w:r>
     </w:p>
     <w:p>
@@ -1004,6 +1033,7 @@
           <w:ilvl w:val="0"/>
           <w:numId w:val="3"/>
         </w:numPr>
+        <w:spacing w:line="360" w:lineRule="auto"/>
         <w:jc w:val="both"/>
         <w:rPr>
           <w:b w:val="0"/>
@@ -1021,6 +1051,7 @@
           <w:sz w:val="24"/>
           <w:szCs w:val="24"/>
         </w:rPr>
+        <w:lastRenderedPageBreak/>
         <w:t>Create a mobile application that shows gas levels, days until depletion, and usage trends.</w:t>
       </w:r>
     </w:p>
@@ -1054,18 +1085,7 @@
           <w:sz w:val="24"/>
           <w:szCs w:val="24"/>
         </w:rPr>
-        <w:t xml:space="preserve">This project uses time-series sensor data collected by the authors, rather than a publicly available dataset. The ESP32 unit captures cylinder weight (kg) and gas concentration every 5 </w:t>
-      </w:r>
-      <w:r>
-        <w:rPr>
-          <w:b w:val="0"/>
-          <w:bCs w:val="0"/>
-          <w:color w:val="auto"/>
-          <w:sz w:val="24"/>
-          <w:szCs w:val="24"/>
-        </w:rPr>
-        <w:lastRenderedPageBreak/>
-        <w:t>minutes, tagging each reading with a device ID and timestamp, and transmits it via HTTP to a cloud-hosted PostgreSQL database. Each record contains four fields:</w:t>
+        <w:t>This project uses time-series sensor data collected by the authors, rather than a publicly available dataset. The ESP32 unit captures cylinder weight (kg) and gas concentration every 5 minutes, tagging each reading with a device ID and timestamp, and transmits it via HTTP to a cloud-hosted PostgreSQL database. Each record contains four fields:</w:t>
       </w:r>
     </w:p>
     <w:p>
@@ -1075,7 +1095,7 @@
           <w:ilvl w:val="0"/>
           <w:numId w:val="4"/>
         </w:numPr>
-        <w:spacing w:before="0" w:after="0"/>
+        <w:spacing w:before="0" w:after="0" w:line="360" w:lineRule="auto"/>
         <w:jc w:val="both"/>
         <w:rPr>
           <w:b w:val="0"/>
@@ -1103,7 +1123,7 @@
           <w:ilvl w:val="0"/>
           <w:numId w:val="4"/>
         </w:numPr>
-        <w:spacing w:before="0" w:after="0"/>
+        <w:spacing w:before="0" w:after="0" w:line="360" w:lineRule="auto"/>
         <w:jc w:val="both"/>
         <w:rPr>
           <w:b w:val="0"/>
@@ -1131,7 +1151,7 @@
           <w:ilvl w:val="0"/>
           <w:numId w:val="4"/>
         </w:numPr>
-        <w:spacing w:before="0" w:after="0"/>
+        <w:spacing w:before="0" w:after="0" w:line="360" w:lineRule="auto"/>
         <w:jc w:val="both"/>
         <w:rPr>
           <w:b w:val="0"/>
@@ -1159,7 +1179,7 @@
           <w:ilvl w:val="0"/>
           <w:numId w:val="4"/>
         </w:numPr>
-        <w:spacing w:before="0" w:after="0"/>
+        <w:spacing w:before="0" w:after="0" w:line="360" w:lineRule="auto"/>
         <w:jc w:val="both"/>
         <w:rPr>
           <w:b w:val="0"/>
@@ -1523,6 +1543,7 @@
                 <w:sz w:val="22"/>
                 <w:szCs w:val="22"/>
               </w:rPr>
+              <w:lastRenderedPageBreak/>
               <w:t>Minimum weight</w:t>
             </w:r>
           </w:p>
@@ -1795,7 +1816,6 @@
           <w:sz w:val="24"/>
           <w:szCs w:val="24"/>
         </w:rPr>
-        <w:lastRenderedPageBreak/>
         <w:t>The threshold-based change-point algorithm (weight rise &gt;1 kg between hour bins) initially flagged three events, but one refill had spanned two consecutive bins. After merging adjacent flags, two genuine refill events remained, consistent with the three observed fill-up cycles.</w:t>
       </w:r>
     </w:p>
@@ -1983,7 +2003,7 @@
           <w:ilvl w:val="0"/>
           <w:numId w:val="6"/>
         </w:numPr>
-        <w:spacing w:line="360" w:lineRule="auto"/>
+        <w:spacing w:before="0" w:line="360" w:lineRule="auto"/>
         <w:jc w:val="both"/>
         <w:rPr>
           <w:b w:val="0"/>
@@ -2011,7 +2031,7 @@
           <w:ilvl w:val="0"/>
           <w:numId w:val="6"/>
         </w:numPr>
-        <w:spacing w:line="360" w:lineRule="auto"/>
+        <w:spacing w:before="0" w:line="360" w:lineRule="auto"/>
         <w:jc w:val="both"/>
         <w:rPr>
           <w:b w:val="0"/>
@@ -2029,6 +2049,7 @@
           <w:sz w:val="24"/>
           <w:szCs w:val="24"/>
         </w:rPr>
+        <w:lastRenderedPageBreak/>
         <w:t>A secondary regression model used time-index features — hour of day, day of week, and 6h/24h rolling averages — for comparison.</w:t>
       </w:r>
     </w:p>
@@ -2039,7 +2060,7 @@
           <w:ilvl w:val="0"/>
           <w:numId w:val="6"/>
         </w:numPr>
-        <w:spacing w:line="360" w:lineRule="auto"/>
+        <w:spacing w:before="0" w:line="360" w:lineRule="auto"/>
         <w:jc w:val="both"/>
         <w:rPr>
           <w:b w:val="0"/>
@@ -2058,20 +2079,6 @@
           <w:szCs w:val="24"/>
         </w:rPr>
         <w:t>Models were evaluated using MAE and RMSE over a 3-day test period.</w:t>
-      </w:r>
-    </w:p>
-    <w:p>
-      <w:pPr>
-        <w:rPr>
-          <w:b/>
-          <w:bCs/>
-          <w:color w:val="1F2937"/>
-          <w:sz w:val="26"/>
-          <w:szCs w:val="26"/>
-        </w:rPr>
-      </w:pPr>
-      <w:r>
-        <w:br w:type="page"/>
       </w:r>
     </w:p>
     <w:p>
@@ -2080,7 +2087,6 @@
         <w:spacing w:line="360" w:lineRule="auto"/>
       </w:pPr>
       <w:r>
-        <w:lastRenderedPageBreak/>
         <w:t>5.4 Leak Detection</w:t>
       </w:r>
     </w:p>
@@ -2237,7 +2243,11 @@
         <w:jc w:val="both"/>
       </w:pPr>
       <w:r>
-        <w:t>The mobile app is built with Kotlin and Jetpack Compose. The GasMonitorScreen shows a gauge arc with estimated days left, live weight/sensor readings, and a forecasting panel comparing the statistical baseline against the SARIMA prediction, with layout and colour reflecting normal vs. alert state. Figure 1 shows the screen implementation in Android Studio with both preview states.</w:t>
+        <w:t xml:space="preserve">The mobile app is built with Kotlin and Jetpack Compose. The GasMonitorScreen shows a gauge arc with estimated days left, live weight/sensor readings, and a forecasting panel comparing the statistical baseline against the SARIMA prediction, with layout and colour </w:t>
+      </w:r>
+      <w:r>
+        <w:lastRenderedPageBreak/>
+        <w:t>reflecting normal vs. alert state. Figure 1 shows the screen implementation in Android Studio with both preview states.</w:t>
       </w:r>
     </w:p>
     <w:p>
@@ -2249,7 +2259,6 @@
         <w:rPr>
           <w:noProof/>
         </w:rPr>
-        <w:lastRenderedPageBreak/>
         <w:drawing>
           <wp:inline distT="0" distB="0" distL="0" distR="0" wp14:anchorId="34C51770" wp14:editId="0820F8F6">
             <wp:extent cx="4114800" cy="2172600"/>
@@ -2580,18 +2589,8 @@
           <w:sz w:val="24"/>
           <w:szCs w:val="24"/>
         </w:rPr>
-        <w:t xml:space="preserve">The rolling 7-day linear regression estimated average daily consumption at ≈0.99 kg/day, giving a projected ≈3.1 days to expiration at the start of the evaluation window. The STL decomposition separated a linearly decreasing trend from a repeating daily seasonal </w:t>
-      </w:r>
-      <w:r>
-        <w:rPr>
-          <w:b w:val="0"/>
-          <w:bCs w:val="0"/>
-          <w:color w:val="auto"/>
-          <w:sz w:val="24"/>
-          <w:szCs w:val="24"/>
-        </w:rPr>
         <w:lastRenderedPageBreak/>
-        <w:t>component, which dipped lowest around 19:00–21:00 (cooking) with a smaller morning peak. Residuals stayed near zero throughout, showing that trend and seasonality accounted for most of the variation.</w:t>
+        <w:t>The rolling 7-day linear regression estimated average daily consumption at ≈0.99 kg/day, giving a projected ≈3.1 days to expiration at the start of the evaluation window. The STL decomposition separated a linearly decreasing trend from a repeating daily seasonal component, which dipped lowest around 19:00–21:00 (cooking) with a smaller morning peak. Residuals stayed near zero throughout, showing that trend and seasonality accounted for most of the variation.</w:t>
       </w:r>
     </w:p>
     <w:p>
@@ -2994,6 +2993,7 @@
     <w:p>
       <w:pPr>
         <w:pStyle w:val="Heading1"/>
+        <w:spacing w:line="360" w:lineRule="auto"/>
         <w:jc w:val="both"/>
         <w:rPr>
           <w:b w:val="0"/>
@@ -3006,6 +3006,7 @@
         <w:rPr>
           <w:b w:val="0"/>
           <w:bCs w:val="0"/>
+          <w:color w:val="auto"/>
           <w:sz w:val="24"/>
           <w:szCs w:val="24"/>
         </w:rPr>
@@ -3018,6 +3019,7 @@
         <w:spacing w:line="360" w:lineRule="auto"/>
       </w:pPr>
       <w:r>
+        <w:lastRenderedPageBreak/>
         <w:t>8. Conclusion</w:t>
       </w:r>
     </w:p>
@@ -3036,7 +3038,6 @@
         <w:jc w:val="both"/>
       </w:pPr>
       <w:r>
-        <w:lastRenderedPageBreak/>
         <w:t>SARIMA was the best-performing model, cutting forecast error roughly tenfold versus the rolling linear regression by explicitly modelling daily cooking-cycle seasonality, while the threshold-based leak detector successfully caught the test leak within 20 minutes. Future work includes multi-cylinder monitoring, gas-sensor calibration, and longer-term data collection.</w:t>
       </w:r>
     </w:p>
@@ -3073,7 +3074,13 @@
         <w:jc w:val="both"/>
       </w:pPr>
       <w:r>
-        <w:t>Cleveland, R.B., Cleveland, W.S., McRae, J.E. and Terpenning, I. (1990) 'STL: A seasonal-trend decomposition procedure based on loess', Journal of Official Statistics, 6(1), pp. 3–73.</w:t>
+        <w:t>Cleveland, R.B., Cleveland, W.S., McRae, J.E. and Terpenning, I. (1990) 'STL: A seasonal-trend decomposition procedure based on loess', Journal of Official Statistics, 6, pp. 3–</w:t>
+      </w:r>
+      <w:r>
+        <w:t>3</w:t>
+      </w:r>
+      <w:r>
+        <w:t>3.</w:t>
       </w:r>
     </w:p>
     <w:p>
@@ -4379,6 +4386,7 @@
   <w:style w:type="character" w:default="1" w:styleId="DefaultParagraphFont">
     <w:name w:val="Default Paragraph Font"/>
     <w:uiPriority w:val="1"/>
+    <w:semiHidden/>
     <w:unhideWhenUsed/>
   </w:style>
   <w:style w:type="table" w:default="1" w:styleId="TableNormal">

</xml_diff>